<commit_message>
Resume handling: real-PDF path, education + block grammars, tables, hygiene
RESUME_PLAN R1-R6: hand-rolled minimal PDF writer (no new dependency)
gives the golden corpus a real .pdf persona (P21, 28 profiles now);
education line grammar with an institution-required guard so 'MS Office
2016' never becomes a degree; block-form experience pairing gated on a
pure-range-line dominance check; DOCX table text read (skills grids);
contact-line names split on pipe separators; PDF hygiene dedupes
per-page headers and heals hyphen-split words while two-column reading
order stays a named descope. One gold regeneration, reviewed. 198 tests.
</commit_message>
<xml_diff>
--- a/goldens/t1/resume_p01.docx
+++ b/goldens/t1/resume_p01.docx
@@ -23,6 +23,38 @@
         <w:t>Skills: Python, Airflow, SQL</w:t>
       </w:r>
     </w:p>
+    <w:tbl>
+      <w:tblPr>
+        <w:tblW w:type="auto" w:w="0"/>
+        <w:tblLook w:firstColumn="1" w:firstRow="1" w:lastColumn="0" w:lastRow="0" w:noHBand="0" w:noVBand="1" w:val="04A0"/>
+      </w:tblPr>
+      <w:tblGrid>
+        <w:gridCol w:w="4320"/>
+        <w:gridCol w:w="4320"/>
+      </w:tblGrid>
+      <w:tr>
+        <w:tc>
+          <w:tcPr>
+            <w:tcW w:type="dxa" w:w="4320"/>
+          </w:tcPr>
+          <w:p>
+            <w:r>
+              <w:t>Terraform</w:t>
+            </w:r>
+          </w:p>
+        </w:tc>
+        <w:tc>
+          <w:tcPr>
+            <w:tcW w:type="dxa" w:w="4320"/>
+          </w:tcPr>
+          <w:p>
+            <w:r>
+              <w:t>Airflow</w:t>
+            </w:r>
+          </w:p>
+        </w:tc>
+      </w:tr>
+    </w:tbl>
     <w:sectPr>
       <w:pgSz w:w="12240" w:h="15840"/>
       <w:pgMar w:top="1440" w:right="1800" w:bottom="1440" w:left="1800" w:header="720" w:footer="720" w:gutter="0"/>

</xml_diff>